<commit_message>
docs: add cover page details and group member information to project reports
</commit_message>
<xml_diff>
--- a/BloodLife_Project_Report.docx
+++ b/BloodLife_Project_Report.docx
@@ -4,41 +4,267 @@
   <w:body>
     <w:p>
       <w:pPr>
-        <w:spacing w:before="0" w:after="40"/>
+        <w:spacing w:before="720"/>
+        <w:jc w:val="center"/>
       </w:pPr>
       <w:r>
         <w:rPr>
-          <w:rFonts w:ascii="Arial" w:hAnsi="Arial"/>
           <w:b/>
-          <w:color w:val="000000"/>
-          <w:sz w:val="40"/>
+          <w:color w:val="555555"/>
+          <w:sz w:val="24"/>
         </w:rPr>
-        <w:t>Project Report: BloodLife Management System</w:t>
+        <w:t>PROJECT REPORT ON</w:t>
       </w:r>
     </w:p>
     <w:p>
       <w:pPr>
-        <w:spacing w:after="240"/>
+        <w:spacing w:before="240" w:after="240"/>
+        <w:jc w:val="center"/>
+      </w:pPr>
+      <w:r>
+        <w:rPr>
+          <w:b/>
+          <w:color w:val="000000"/>
+          <w:sz w:val="48"/>
+        </w:rPr>
+        <w:t>BLOODLIFE MANAGEMENT SYSTEM</w:t>
+      </w:r>
+    </w:p>
+    <w:p>
+      <w:pPr>
+        <w:spacing w:after="720"/>
+        <w:jc w:val="center"/>
       </w:pPr>
       <w:r>
         <w:rPr>
           <w:i/>
-          <w:color w:val="555555"/>
-          <w:sz w:val="19"/>
+          <w:color w:val="444444"/>
+          <w:sz w:val="22"/>
         </w:rPr>
-        <w:t>Technical &amp; Architectural Specification | August 2026</w:t>
+        <w:t>A Web-Based Blood Donation &amp; Donor Tracking Platform</w:t>
       </w:r>
     </w:p>
     <w:p>
       <w:pPr>
-        <w:spacing w:after="240"/>
+        <w:spacing w:after="720"/>
+        <w:jc w:val="center"/>
       </w:pPr>
       <w:r>
         <w:rPr>
           <w:b/>
           <w:color w:val="000000"/>
         </w:rPr>
-        <w:t>――――――――――――――――――――――――――――――――――――――――――――――――――――――――――</w:t>
+        <w:t>―――――――――――――――――――――――――――――――――――――――――――――</w:t>
+      </w:r>
+    </w:p>
+    <w:p>
+      <w:pPr>
+        <w:spacing w:after="160"/>
+      </w:pPr>
+      <w:r>
+        <w:rPr>
+          <w:b/>
+          <w:sz w:val="22"/>
+        </w:rPr>
+        <w:t>SUBMITTED BY (GROUP MEMBERS):</w:t>
+      </w:r>
+    </w:p>
+    <w:tbl>
+      <w:tblPr>
+        <w:tblW w:type="auto" w:w="0"/>
+        <w:jc w:val="center"/>
+        <w:tblLook w:firstColumn="1" w:firstRow="1" w:lastColumn="0" w:lastRow="0" w:noHBand="0" w:noVBand="1" w:val="04A0"/>
+      </w:tblPr>
+      <w:tblGrid>
+        <w:gridCol w:w="3312"/>
+        <w:gridCol w:w="3312"/>
+        <w:gridCol w:w="3312"/>
+      </w:tblGrid>
+      <w:tr>
+        <w:tc>
+          <w:tcPr>
+            <w:tcW w:type="dxa" w:w="3312"/>
+            <w:shd w:fill="000000"/>
+          </w:tcPr>
+          <w:p>
+            <w:r>
+              <w:rPr>
+                <w:b/>
+                <w:color w:val="FFFFFF"/>
+              </w:rPr>
+              <w:t>SL</w:t>
+            </w:r>
+          </w:p>
+        </w:tc>
+        <w:tc>
+          <w:tcPr>
+            <w:tcW w:type="dxa" w:w="3312"/>
+            <w:shd w:fill="000000"/>
+          </w:tcPr>
+          <w:p>
+            <w:r>
+              <w:rPr>
+                <w:b/>
+                <w:color w:val="FFFFFF"/>
+              </w:rPr>
+              <w:t>Student Name</w:t>
+            </w:r>
+          </w:p>
+        </w:tc>
+        <w:tc>
+          <w:tcPr>
+            <w:tcW w:type="dxa" w:w="3312"/>
+            <w:shd w:fill="000000"/>
+          </w:tcPr>
+          <w:p>
+            <w:r>
+              <w:rPr>
+                <w:b/>
+                <w:color w:val="FFFFFF"/>
+              </w:rPr>
+              <w:t>Student ID</w:t>
+            </w:r>
+          </w:p>
+        </w:tc>
+      </w:tr>
+      <w:tr>
+        <w:tc>
+          <w:tcPr>
+            <w:tcW w:type="dxa" w:w="3312"/>
+          </w:tcPr>
+          <w:p>
+            <w:r>
+              <w:t>1</w:t>
+            </w:r>
+          </w:p>
+        </w:tc>
+        <w:tc>
+          <w:tcPr>
+            <w:tcW w:type="dxa" w:w="3312"/>
+          </w:tcPr>
+          <w:p>
+            <w:r>
+              <w:t>Md. Mushfiq Kabir</w:t>
+            </w:r>
+          </w:p>
+        </w:tc>
+        <w:tc>
+          <w:tcPr>
+            <w:tcW w:type="dxa" w:w="3312"/>
+          </w:tcPr>
+          <w:p>
+            <w:r>
+              <w:t>42250202488</w:t>
+            </w:r>
+          </w:p>
+        </w:tc>
+      </w:tr>
+      <w:tr>
+        <w:tc>
+          <w:tcPr>
+            <w:tcW w:type="dxa" w:w="3312"/>
+            <w:shd w:fill="F2F2F2"/>
+          </w:tcPr>
+          <w:p>
+            <w:r>
+              <w:t>2</w:t>
+            </w:r>
+          </w:p>
+        </w:tc>
+        <w:tc>
+          <w:tcPr>
+            <w:tcW w:type="dxa" w:w="3312"/>
+            <w:shd w:fill="F2F2F2"/>
+          </w:tcPr>
+          <w:p>
+            <w:r>
+              <w:t>Most. Umme Kulsum</w:t>
+            </w:r>
+          </w:p>
+        </w:tc>
+        <w:tc>
+          <w:tcPr>
+            <w:tcW w:type="dxa" w:w="3312"/>
+            <w:shd w:fill="F2F2F2"/>
+          </w:tcPr>
+          <w:p>
+            <w:r>
+              <w:t>42250202504</w:t>
+            </w:r>
+          </w:p>
+        </w:tc>
+      </w:tr>
+      <w:tr>
+        <w:tc>
+          <w:tcPr>
+            <w:tcW w:type="dxa" w:w="3312"/>
+          </w:tcPr>
+          <w:p>
+            <w:r>
+              <w:t>3</w:t>
+            </w:r>
+          </w:p>
+        </w:tc>
+        <w:tc>
+          <w:tcPr>
+            <w:tcW w:type="dxa" w:w="3312"/>
+          </w:tcPr>
+          <w:p>
+            <w:r>
+              <w:t>Nowrin Kabir Agni</w:t>
+            </w:r>
+          </w:p>
+        </w:tc>
+        <w:tc>
+          <w:tcPr>
+            <w:tcW w:type="dxa" w:w="3312"/>
+          </w:tcPr>
+          <w:p>
+            <w:r>
+              <w:t>42250202491</w:t>
+            </w:r>
+          </w:p>
+        </w:tc>
+      </w:tr>
+    </w:tbl>
+    <w:p/>
+    <w:p>
+      <w:pPr>
+        <w:spacing w:before="400" w:after="80"/>
+      </w:pPr>
+      <w:r>
+        <w:rPr>
+          <w:b/>
+          <w:sz w:val="22"/>
+        </w:rPr>
+        <w:t>SUBMITTED TO:</w:t>
+      </w:r>
+    </w:p>
+    <w:p>
+      <w:r>
+        <w:t>M. A. Jobayer Bin Bakkre</w:t>
+        <w:br/>
+        <w:t>Department of Computer Science &amp; Engineering</w:t>
+        <w:br/>
+        <w:t>Northern University Bangladesh</w:t>
+      </w:r>
+    </w:p>
+    <w:p>
+      <w:pPr>
+        <w:spacing w:before="600"/>
+        <w:jc w:val="center"/>
+      </w:pPr>
+      <w:r>
+        <w:rPr>
+          <w:b/>
+          <w:sz w:val="20"/>
+        </w:rPr>
+        <w:t>Date of Submission: 14 August 2026</w:t>
+      </w:r>
+    </w:p>
+    <w:p>
+      <w:r>
+        <w:br w:type="page"/>
       </w:r>
     </w:p>
     <w:p>

</xml_diff>